<commit_message>
Replace volume 378 cover with flowing three-world artwork in web, PDF and Word
</commit_message>
<xml_diff>
--- a/public/books/m/378/downloads/motivation-v1.0.docx
+++ b/public/books/m/378/downloads/motivation-v1.0.docx
@@ -4,58 +4,50 @@
   <w:body>
     <w:p>
       <w:pPr>
-        <w:spacing w:before="1000"/>
+        <w:spacing w:before="0" w:after="0" w:line="20" w:lineRule="exact"/>
         <w:ind w:firstLine="0"/>
       </w:pPr>
       <w:r>
-        <w:t>DEMAI INTERNATIONAL PRESS</w:t>
-      </w:r>
-    </w:p>
-    <w:p>
-      <w:pPr>
-        <w:pStyle w:val="Title"/>
-      </w:pPr>
-      <w:r>
-        <w:t>内驱力的虚幻</w:t>
-      </w:r>
-    </w:p>
-    <w:p>
-      <w:pPr>
-        <w:pStyle w:val="Subtitle"/>
-      </w:pPr>
-      <w:r>
-        <w:t>三界动力纠缠的SDE发生学</w:t>
-      </w:r>
-    </w:p>
-    <w:p>
-      <w:pPr>
-        <w:spacing w:before="480"/>
-        <w:ind w:firstLine="0"/>
-      </w:pPr>
-      <w:r>
-        <w:t>王德生 著</w:t>
-      </w:r>
-    </w:p>
-    <w:p>
-      <w:pPr>
-        <w:spacing w:before="1100"/>
-        <w:ind w:firstLine="0"/>
-      </w:pPr>
-      <w:r>
-        <w:rPr>
-          <w:color w:val="B18B45"/>
-        </w:rPr>
-        <w:t>理念 · 现实 · 自我</w:t>
-      </w:r>
-    </w:p>
-    <w:p>
-      <w:r>
-        <w:t>德麦国际专著 第378卷</w:t>
-      </w:r>
-    </w:p>
-    <w:p>
-      <w:r>
-        <w:t>德麦国际出版社  |  2026年10月</w:t>
+        <w:drawing>
+          <wp:anchor distT="0" distB="0" distL="0" distR="0" simplePos="0" relativeHeight="0" behindDoc="1" locked="0" layoutInCell="1" allowOverlap="1">
+            <wp:simplePos x="0" y="0"/>
+            <wp:positionH relativeFrom="page">
+              <wp:posOffset>0</wp:posOffset>
+            </wp:positionH>
+            <wp:positionV relativeFrom="page">
+              <wp:posOffset>0</wp:posOffset>
+            </wp:positionV>
+            <wp:extent cx="6840000" cy="9000000"/>
+            <wp:wrapNone/>
+            <wp:docPr id="1" name="Picture 1"/>
+            <wp:cNvGraphicFramePr xmlns:a="http://schemas.openxmlformats.org/drawingml/2006/main">
+              <a:graphicFrameLocks noChangeAspect="1"/>
+            </wp:cNvGraphicFramePr>
+            <a:graphic xmlns:a="http://schemas.openxmlformats.org/drawingml/2006/main" xmlns:pic="http://schemas.openxmlformats.org/drawingml/2006/picture">
+              <a:graphicData uri="http://schemas.openxmlformats.org/drawingml/2006/picture">
+                <pic:pic>
+                  <pic:nvPicPr>
+                    <pic:cNvPr id="0" name="exec-818cde7b-38e0-40d0-92f6-8311103c9bde.png"/>
+                    <pic:cNvPicPr/>
+                  </pic:nvPicPr>
+                  <pic:blipFill>
+                    <a:blip r:embed="rId11"/>
+                    <a:stretch>
+                      <a:fillRect/>
+                    </a:stretch>
+                  </pic:blipFill>
+                  <pic:spPr>
+                    <a:xfrm>
+                      <a:off x="0" y="0"/>
+                      <a:ext cx="6840000" cy="9000000"/>
+                    </a:xfrm>
+                    <a:prstGeom prst="rect"/>
+                  </pic:spPr>
+                </pic:pic>
+              </a:graphicData>
+            </a:graphic>
+          </wp:anchor>
+        </w:drawing>
       </w:r>
     </w:p>
     <w:p>

</xml_diff>